<commit_message>
feat(certificates): add script to regenerate internship certificates with font validation and update deployment documentation for font requirements
</commit_message>
<xml_diff>
--- a/frontend/public/course-certificates/Airkrit Certificates/Airkrit India Certificate Internship - AI-01171 - Template.docx
+++ b/frontend/public/course-certificates/Airkrit Certificates/Airkrit India Certificate Internship - AI-01171 - Template.docx
@@ -506,7 +506,7 @@
                         <wps:spPr>
                           <a:xfrm>
                             <a:off x="0" y="67600"/>
-                            <a:ext cx="1099820" cy="171450"/>
+                            <a:ext cx="1800000" cy="171450"/>
                           </a:xfrm>
                           <a:prstGeom prst="rect">
                             <a:avLst/>
@@ -577,8 +577,8 @@
                             </w:p>
                           </w:txbxContent>
                         </wps:txbx>
-                        <wps:bodyPr wrap="square" lIns="0" tIns="0" rIns="0" bIns="0" rtlCol="0">
-                          <a:noAutofit/>
+                        <wps:bodyPr wrap="none" lIns="0" tIns="0" rIns="0" bIns="0" rtlCol="0">
+                          <a:spAutoFit/>
                         </wps:bodyPr>
                       </wps:wsp>
                       <wps:wsp>
@@ -586,8 +586,8 @@
                         <wps:cNvSpPr txBox="1"/>
                         <wps:spPr>
                           <a:xfrm>
-                            <a:off x="1862509" y="713776"/>
-                            <a:ext cx="2214245" cy="171450"/>
+                            <a:off x="911542" y="713776"/>
+                            <a:ext cx="4114800" cy="171450"/>
                           </a:xfrm>
                           <a:prstGeom prst="rect">
                             <a:avLst/>
@@ -597,6 +597,7 @@
                           <w:txbxContent>
                             <w:p>
                               <w:pPr>
+                                <w:jc w:val="center"/>
                                 <w:rPr>
                                   <w:b/>
                                 </w:rPr>
@@ -683,7 +684,7 @@
                           </w:txbxContent>
                         </wps:txbx>
                         <wps:bodyPr wrap="square" lIns="0" tIns="0" rIns="0" bIns="0" rtlCol="0">
-                          <a:noAutofit/>
+                          <a:normAutofit/>
                         </wps:bodyPr>
                       </wps:wsp>
                       <wps:wsp>
@@ -1374,7 +1375,7 @@
                   <v:stroke joinstyle="miter"/>
                   <v:path gradientshapeok="t" o:connecttype="rect"/>
                 </v:shapetype>
-                <v:shape id="Textbox 5" o:spid="_x0000_s1028" type="#_x0000_t202" style="position:absolute;top:676;width:10998;height:1714;visibility:visible;mso-wrap-style:square;v-text-anchor:top" o:gfxdata="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" filled="f" stroked="f">
+                <v:shape id="Textbox 5" o:spid="_x0000_s1028" type="#_x0000_t202" style="position:absolute;top:676;width:18000;height:1714;visibility:visible;mso-wrap-style:none;v-text-anchor:top" o:gfxdata="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" filled="f" stroked="f">
                   <v:textbox inset="0,0,0,0">
                     <w:txbxContent>
                       <w:p>

</xml_diff>